<commit_message>
Report: data de criação e telefone do cliente, cache-bust do PDF e validação da conversão
- Novos placeholders no documento de acompanhamento: ${order_date} (data de
  criação da encomenda, dd/mm/aaaa) e ${client_phone} (billing_phone do perfil
  do cliente).
- ?v=<mtime> no URL do PDF devolvido, para o browser/CDN não servir uma cópia
  antiga — o nome do ficheiro é sempre o mesmo entre gerações.
- Valida que o serviço de conversão devolveu mesmo um PDF; caso contrário devolve
  erro 502 em vez de gravar um ficheiro inválido.

Co-Authored-By: Claude Sonnet 5 <noreply@anthropic.com>
</commit_message>
<xml_diff>
--- a/wp-content/plugins/ad-pulse/assets/report_template.docx
+++ b/wp-content/plugins/ad-pulse/assets/report_template.docx
@@ -25,8 +25,6 @@
         <w:spacing w:after="40" w:line="360" w:lineRule="auto"/>
         <w:jc w:val="right"/>
         <w:rPr>
-          <w:b w:val="1"/>
-          <w:bCs w:val="1"/>
           <w:color w:val="0c0c0c"/>
           <w:sz w:val="18"/>
           <w:szCs w:val="18"/>
@@ -42,6 +40,15 @@
           <w:rtl w:val="0"/>
         </w:rPr>
         <w:t xml:space="preserve">${order_number}</w:t>
+      </w:r>
+      <w:r>
+        <w:rPr>
+          <w:color w:val="0c0c0c"/>
+          <w:sz w:val="18"/>
+          <w:szCs w:val="18"/>
+          <w:rtl w:val="0"/>
+        </w:rPr>
+        <w:t xml:space="preserve"> (aberto a ${order_date})</w:t>
       </w:r>
     </w:p>
     <w:p>
@@ -64,12 +71,7 @@
           <w:szCs w:val="18"/>
           <w:rtl w:val="0"/>
         </w:rPr>
-        <w:t xml:space="preserve">Cliente: ${client_name} | Loja: ${store_name}</w:t>
-      </w:r>
-      <w:r>
-        <w:rPr>
-          <w:rtl w:val="0"/>
-        </w:rPr>
+        <w:t xml:space="preserve">Cliente: ${client_name} | ${client_phone}</w:t>
       </w:r>
     </w:p>
     <w:p>
@@ -92,7 +94,7 @@
           <w:szCs w:val="18"/>
           <w:rtl w:val="0"/>
         </w:rPr>
-        <w:t xml:space="preserve">Responsável pelo processo: ${seller_name}</w:t>
+        <w:t xml:space="preserve">Loja: ${store_name} | Responsável pelo processo: ${seller_name}</w:t>
       </w:r>
     </w:p>
     <w:p>
@@ -236,11 +238,6 @@
         </w:rPr>
         <w:t xml:space="preserve">${product_meta_block}</w:t>
       </w:r>
-      <w:r>
-        <w:rPr>
-          <w:rtl w:val="0"/>
-        </w:rPr>
-      </w:r>
     </w:p>
     <w:p>
       <w:pPr>
@@ -283,11 +280,6 @@
         </w:rPr>
         <w:t xml:space="preserve">${product_meta_value}</w:t>
       </w:r>
-      <w:r>
-        <w:rPr>
-          <w:rtl w:val="0"/>
-        </w:rPr>
-      </w:r>
     </w:p>
     <w:p>
       <w:pPr>
@@ -306,11 +298,6 @@
           <w:rtl w:val="0"/>
         </w:rPr>
         <w:t xml:space="preserve">${/product_meta_block}</w:t>
-      </w:r>
-      <w:r>
-        <w:rPr>
-          <w:rtl w:val="0"/>
-        </w:rPr>
       </w:r>
     </w:p>
     <w:p>
@@ -591,7 +578,7 @@
             <wp:extent cx="1080000" cy="764237"/>
             <wp:effectExtent b="0" l="0" r="0" t="0"/>
             <wp:wrapTopAndBottom distB="0" distT="0"/>
-            <wp:docPr id="1" name="image2.jpg"/>
+            <wp:docPr id="3" name="image2.jpg"/>
             <a:graphic>
               <a:graphicData uri="http://schemas.openxmlformats.org/drawingml/2006/picture">
                 <pic:pic>
@@ -649,7 +636,6 @@
     <w:pPr>
       <w:keepNext w:val="0"/>
       <w:keepLines w:val="0"/>
-      <w:pageBreakBefore w:val="0"/>
       <w:widowControl w:val="1"/>
       <w:pBdr>
         <w:top w:space="0" w:sz="0" w:val="nil"/>
@@ -732,7 +718,6 @@
     <w:pPr>
       <w:keepNext w:val="0"/>
       <w:keepLines w:val="0"/>
-      <w:pageBreakBefore w:val="0"/>
       <w:widowControl w:val="1"/>
       <w:pBdr>
         <w:top w:space="0" w:sz="0" w:val="nil"/>
@@ -794,7 +779,6 @@
     <w:pPr>
       <w:keepNext w:val="0"/>
       <w:keepLines w:val="0"/>
-      <w:pageBreakBefore w:val="0"/>
       <w:widowControl w:val="1"/>
       <w:pBdr>
         <w:top w:space="0" w:sz="0" w:val="nil"/>
@@ -845,7 +829,7 @@
           <wp:extent cx="1620000" cy="1146356"/>
           <wp:effectExtent b="0" l="0" r="0" t="0"/>
           <wp:wrapTopAndBottom distB="0" distT="0"/>
-          <wp:docPr id="2" name="image1.jpg"/>
+          <wp:docPr id="4" name="image1.jpg"/>
           <a:graphic>
             <a:graphicData uri="http://schemas.openxmlformats.org/drawingml/2006/picture">
               <pic:pic>
@@ -879,7 +863,6 @@
     <w:pPr>
       <w:keepNext w:val="0"/>
       <w:keepLines w:val="0"/>
-      <w:pageBreakBefore w:val="0"/>
       <w:widowControl w:val="1"/>
       <w:pBdr>
         <w:top w:space="0" w:sz="0" w:val="nil"/>
@@ -1058,6 +1041,20 @@
       <w:sz w:val="56"/>
       <w:szCs w:val="56"/>
     </w:rPr>
+  </w:style>
+  <w:style w:type="table" w:styleId="TableNormal" w:default="1">
+    <w:name w:val="TableNormal"/>
+    <w:tblPr>
+      <w:tblCellMar>
+        <w:top w:w="100.0" w:type="dxa"/>
+        <w:left w:w="100.0" w:type="dxa"/>
+        <w:bottom w:w="100.0" w:type="dxa"/>
+        <w:right w:w="100.0" w:type="dxa"/>
+      </w:tblCellMar>
+    </w:tblPr>
+  </w:style>
+  <w:style w:type="paragraph" w:styleId="Normal" w:default="1">
+    <w:name w:val="normal"/>
   </w:style>
   <w:style w:type="paragraph" w:styleId="Subtitle">
     <w:name w:val="Subtitle"/>
@@ -1395,7 +1392,7 @@
 
 <file path=customXML/item1.xml><?xml version="1.0" encoding="utf-8"?>
 <go:gDocsCustomXmlDataStorage xmlns:go="http://customooxmlschemas.google.com/" xmlns:r="http://schemas.openxmlformats.org/officeDocument/2006/relationships" uri="GoogleDocsCustomDataVersion2">
-  <go:docsCustomData xmlns:go="http://customooxmlschemas.google.com/" roundtripDataSignature="AMtx7mgRPrjhkqhsWwWSk4qV5bG/R57/4g==">CgMxLjA4AHIhMV9LcWRncWlaTF8xQmstSVM5enhqT0h4QzhsblRXU0V2</go:docsCustomData>
+  <go:docsCustomData xmlns:go="http://customooxmlschemas.google.com/" roundtripDataSignature="AMtx7mjeI3Hz+dL+GUIHfytp76lbHSSoMA==">CgMxLjA4AHIhMTV6ako2SDgtMGk3cTBJRkp0MlotNHFZbk5vSVFGd1Bq</go:docsCustomData>
 </go:gDocsCustomXmlDataStorage>
 </file>
 

</xml_diff>